<commit_message>
Update synopsis document with recent literature reviews on DevSecOps and cybersecurity challenges
</commit_message>
<xml_diff>
--- a/Synopsis/CSEP23605 Review 0 - Synopsis Submission.docx
+++ b/Synopsis/CSEP23605 Review 0 - Synopsis Submission.docx
@@ -445,8 +445,8 @@
       </w:tblPr>
       <w:tblGrid>
         <w:gridCol w:w="713"/>
-        <w:gridCol w:w="3133"/>
-        <w:gridCol w:w="1928"/>
+        <w:gridCol w:w="2826"/>
+        <w:gridCol w:w="2235"/>
         <w:gridCol w:w="1928"/>
         <w:gridCol w:w="1926"/>
       </w:tblGrid>
@@ -710,7 +710,7 @@
         </w:tc>
         <w:tc>
           <w:tcPr>
-            <w:tcW w:w="3133" w:type="dxa"/>
+            <w:tcW w:w="2826" w:type="dxa"/>
             <w:hideMark/>
           </w:tcPr>
           <w:p>
@@ -734,7 +734,7 @@
         </w:tc>
         <w:tc>
           <w:tcPr>
-            <w:tcW w:w="1928" w:type="dxa"/>
+            <w:tcW w:w="2235" w:type="dxa"/>
             <w:hideMark/>
           </w:tcPr>
           <w:p>
@@ -836,7 +836,7 @@
         </w:tc>
         <w:tc>
           <w:tcPr>
-            <w:tcW w:w="3133" w:type="dxa"/>
+            <w:tcW w:w="2826" w:type="dxa"/>
             <w:hideMark/>
           </w:tcPr>
           <w:p>
@@ -847,6 +847,35 @@
                 <w:b/>
               </w:rPr>
             </w:pPr>
+            <w:r>
+              <w:rPr>
+                <w:rFonts w:ascii="Times New Roman" w:hAnsi="Times New Roman" w:cs="Times New Roman"/>
+                <w:b/>
+              </w:rPr>
+              <w:t>Cybersecurity in DevOps Environments: A Systematic Literature Review 2025.</w:t>
+            </w:r>
+          </w:p>
+        </w:tc>
+        <w:tc>
+          <w:tcPr>
+            <w:tcW w:w="2235" w:type="dxa"/>
+            <w:hideMark/>
+          </w:tcPr>
+          <w:p>
+            <w:pPr>
+              <w:spacing w:line="276" w:lineRule="auto"/>
+              <w:rPr>
+                <w:rFonts w:ascii="Times New Roman" w:hAnsi="Times New Roman" w:cs="Times New Roman"/>
+                <w:b/>
+              </w:rPr>
+            </w:pPr>
+            <w:r>
+              <w:rPr>
+                <w:rFonts w:ascii="Times New Roman" w:hAnsi="Times New Roman" w:cs="Times New Roman"/>
+                <w:b/>
+              </w:rPr>
+              <w:t>Systematic literature review.</w:t>
+            </w:r>
           </w:p>
         </w:tc>
         <w:tc>
@@ -862,21 +891,13 @@
                 <w:b/>
               </w:rPr>
             </w:pPr>
-          </w:p>
-        </w:tc>
-        <w:tc>
-          <w:tcPr>
-            <w:tcW w:w="1928" w:type="dxa"/>
-            <w:hideMark/>
-          </w:tcPr>
-          <w:p>
-            <w:pPr>
-              <w:spacing w:line="276" w:lineRule="auto"/>
-              <w:rPr>
-                <w:rFonts w:ascii="Times New Roman" w:hAnsi="Times New Roman" w:cs="Times New Roman"/>
-                <w:b/>
-              </w:rPr>
-            </w:pPr>
+            <w:r>
+              <w:rPr>
+                <w:rFonts w:ascii="Times New Roman" w:hAnsi="Times New Roman" w:cs="Times New Roman"/>
+                <w:b/>
+              </w:rPr>
+              <w:t>Broad evidence and taxonomy.</w:t>
+            </w:r>
           </w:p>
         </w:tc>
         <w:tc>
@@ -892,6 +913,13 @@
                 <w:b/>
               </w:rPr>
             </w:pPr>
+            <w:r>
+              <w:rPr>
+                <w:rFonts w:ascii="Times New Roman" w:hAnsi="Times New Roman" w:cs="Times New Roman"/>
+                <w:b/>
+              </w:rPr>
+              <w:t>No empirical validation.</w:t>
+            </w:r>
           </w:p>
         </w:tc>
       </w:tr>
@@ -926,7 +954,7 @@
         </w:tc>
         <w:tc>
           <w:tcPr>
-            <w:tcW w:w="3133" w:type="dxa"/>
+            <w:tcW w:w="2826" w:type="dxa"/>
             <w:hideMark/>
           </w:tcPr>
           <w:p>
@@ -937,6 +965,69 @@
                 <w:b/>
               </w:rPr>
             </w:pPr>
+            <w:r>
+              <w:rPr>
+                <w:rFonts w:ascii="Times New Roman" w:hAnsi="Times New Roman" w:cs="Times New Roman"/>
+                <w:b/>
+              </w:rPr>
+              <w:t xml:space="preserve">Self-service Cybersecurity Monitoring as Enabler for </w:t>
+            </w:r>
+            <w:proofErr w:type="spellStart"/>
+            <w:r>
+              <w:rPr>
+                <w:rFonts w:ascii="Times New Roman" w:hAnsi="Times New Roman" w:cs="Times New Roman"/>
+                <w:b/>
+              </w:rPr>
+              <w:t>DevSecOps</w:t>
+            </w:r>
+            <w:proofErr w:type="spellEnd"/>
+            <w:r>
+              <w:rPr>
+                <w:rFonts w:ascii="Times New Roman" w:hAnsi="Times New Roman" w:cs="Times New Roman"/>
+                <w:b/>
+              </w:rPr>
+              <w:t xml:space="preserve"> 2019.</w:t>
+            </w:r>
+          </w:p>
+          <w:p>
+            <w:pPr>
+              <w:spacing w:line="276" w:lineRule="auto"/>
+              <w:rPr>
+                <w:rFonts w:ascii="Times New Roman" w:hAnsi="Times New Roman" w:cs="Times New Roman"/>
+                <w:b/>
+              </w:rPr>
+            </w:pPr>
+          </w:p>
+          <w:p>
+            <w:pPr>
+              <w:spacing w:line="276" w:lineRule="auto"/>
+              <w:rPr>
+                <w:rFonts w:ascii="Times New Roman" w:hAnsi="Times New Roman" w:cs="Times New Roman"/>
+                <w:b/>
+              </w:rPr>
+            </w:pPr>
+          </w:p>
+        </w:tc>
+        <w:tc>
+          <w:tcPr>
+            <w:tcW w:w="2235" w:type="dxa"/>
+            <w:hideMark/>
+          </w:tcPr>
+          <w:p>
+            <w:pPr>
+              <w:spacing w:line="276" w:lineRule="auto"/>
+              <w:rPr>
+                <w:rFonts w:ascii="Times New Roman" w:hAnsi="Times New Roman" w:cs="Times New Roman"/>
+                <w:b/>
+              </w:rPr>
+            </w:pPr>
+            <w:r>
+              <w:rPr>
+                <w:rFonts w:ascii="Times New Roman" w:hAnsi="Times New Roman" w:cs="Times New Roman"/>
+                <w:b/>
+              </w:rPr>
+              <w:t>Model-based design case study</w:t>
+            </w:r>
           </w:p>
         </w:tc>
         <w:tc>
@@ -952,21 +1043,29 @@
                 <w:b/>
               </w:rPr>
             </w:pPr>
-          </w:p>
-        </w:tc>
-        <w:tc>
-          <w:tcPr>
-            <w:tcW w:w="1928" w:type="dxa"/>
-            <w:hideMark/>
-          </w:tcPr>
-          <w:p>
-            <w:pPr>
-              <w:spacing w:line="276" w:lineRule="auto"/>
-              <w:rPr>
-                <w:rFonts w:ascii="Times New Roman" w:hAnsi="Times New Roman" w:cs="Times New Roman"/>
-                <w:b/>
-              </w:rPr>
-            </w:pPr>
+            <w:r>
+              <w:rPr>
+                <w:rFonts w:ascii="Times New Roman" w:hAnsi="Times New Roman" w:cs="Times New Roman"/>
+                <w:b/>
+              </w:rPr>
+              <w:t xml:space="preserve">Concrete </w:t>
+            </w:r>
+            <w:proofErr w:type="spellStart"/>
+            <w:r>
+              <w:rPr>
+                <w:rFonts w:ascii="Times New Roman" w:hAnsi="Times New Roman" w:cs="Times New Roman"/>
+                <w:b/>
+              </w:rPr>
+              <w:t>DevSecOps</w:t>
+            </w:r>
+            <w:proofErr w:type="spellEnd"/>
+            <w:r>
+              <w:rPr>
+                <w:rFonts w:ascii="Times New Roman" w:hAnsi="Times New Roman" w:cs="Times New Roman"/>
+                <w:b/>
+              </w:rPr>
+              <w:t xml:space="preserve"> implementation.</w:t>
+            </w:r>
           </w:p>
         </w:tc>
         <w:tc>
@@ -982,6 +1081,13 @@
                 <w:b/>
               </w:rPr>
             </w:pPr>
+            <w:r>
+              <w:rPr>
+                <w:rFonts w:ascii="Times New Roman" w:hAnsi="Times New Roman" w:cs="Times New Roman"/>
+                <w:b/>
+              </w:rPr>
+              <w:t>Limited evaluation scope.</w:t>
+            </w:r>
           </w:p>
         </w:tc>
       </w:tr>
@@ -1016,7 +1122,7 @@
         </w:tc>
         <w:tc>
           <w:tcPr>
-            <w:tcW w:w="3133" w:type="dxa"/>
+            <w:tcW w:w="2826" w:type="dxa"/>
             <w:hideMark/>
           </w:tcPr>
           <w:p>
@@ -1025,8 +1131,58 @@
               <w:rPr>
                 <w:rFonts w:ascii="Times New Roman" w:hAnsi="Times New Roman" w:cs="Times New Roman"/>
                 <w:b/>
-              </w:rPr>
-            </w:pPr>
+                <w:lang w:val="en-US"/>
+              </w:rPr>
+            </w:pPr>
+            <w:r>
+              <w:rPr>
+                <w:rFonts w:ascii="Times New Roman" w:hAnsi="Times New Roman" w:cs="Times New Roman"/>
+                <w:b/>
+                <w:lang w:val="en-US"/>
+              </w:rPr>
+              <w:t xml:space="preserve">Enhancing DevOps Continuous Monitoring Phase: Hybrid Intrusion </w:t>
+            </w:r>
+            <w:r>
+              <w:rPr>
+                <w:rFonts w:ascii="Times New Roman" w:hAnsi="Times New Roman" w:cs="Times New Roman"/>
+                <w:b/>
+                <w:lang w:val="en-US"/>
+              </w:rPr>
+              <w:lastRenderedPageBreak/>
+              <w:t>Detection and Ensemble Learning System (HIDELS), 2026</w:t>
+            </w:r>
+          </w:p>
+          <w:p>
+            <w:pPr>
+              <w:spacing w:line="276" w:lineRule="auto"/>
+              <w:rPr>
+                <w:rFonts w:ascii="Times New Roman" w:hAnsi="Times New Roman" w:cs="Times New Roman"/>
+                <w:b/>
+              </w:rPr>
+            </w:pPr>
+          </w:p>
+        </w:tc>
+        <w:tc>
+          <w:tcPr>
+            <w:tcW w:w="2235" w:type="dxa"/>
+            <w:hideMark/>
+          </w:tcPr>
+          <w:p>
+            <w:pPr>
+              <w:spacing w:line="276" w:lineRule="auto"/>
+              <w:rPr>
+                <w:rFonts w:ascii="Times New Roman" w:hAnsi="Times New Roman" w:cs="Times New Roman"/>
+                <w:b/>
+              </w:rPr>
+            </w:pPr>
+            <w:r>
+              <w:rPr>
+                <w:rFonts w:ascii="Times New Roman" w:hAnsi="Times New Roman" w:cs="Times New Roman"/>
+                <w:b/>
+              </w:rPr>
+              <w:lastRenderedPageBreak/>
+              <w:t>Experimental / Machine Learning-based</w:t>
+            </w:r>
           </w:p>
         </w:tc>
         <w:tc>
@@ -1042,13 +1198,38 @@
                 <w:b/>
               </w:rPr>
             </w:pPr>
-          </w:p>
-        </w:tc>
-        <w:tc>
-          <w:tcPr>
-            <w:tcW w:w="1928" w:type="dxa"/>
-            <w:hideMark/>
-          </w:tcPr>
+            <w:r>
+              <w:rPr>
+                <w:rFonts w:ascii="Times New Roman" w:hAnsi="Times New Roman" w:cs="Times New Roman"/>
+                <w:b/>
+              </w:rPr>
+              <w:t xml:space="preserve">High accuracy, strong robustness, </w:t>
+            </w:r>
+            <w:proofErr w:type="spellStart"/>
+            <w:r>
+              <w:rPr>
+                <w:rFonts w:ascii="Times New Roman" w:hAnsi="Times New Roman" w:cs="Times New Roman"/>
+                <w:b/>
+              </w:rPr>
+              <w:t>DevSecOps</w:t>
+            </w:r>
+            <w:proofErr w:type="spellEnd"/>
+            <w:r>
+              <w:rPr>
+                <w:rFonts w:ascii="Times New Roman" w:hAnsi="Times New Roman" w:cs="Times New Roman"/>
+                <w:b/>
+              </w:rPr>
+              <w:t xml:space="preserve"> </w:t>
+            </w:r>
+            <w:r>
+              <w:rPr>
+                <w:rFonts w:ascii="Times New Roman" w:hAnsi="Times New Roman" w:cs="Times New Roman"/>
+                <w:b/>
+              </w:rPr>
+              <w:lastRenderedPageBreak/>
+              <w:t>automation, lower bias</w:t>
+            </w:r>
+          </w:p>
           <w:p>
             <w:pPr>
               <w:spacing w:line="276" w:lineRule="auto"/>
@@ -1072,6 +1253,22 @@
                 <w:b/>
               </w:rPr>
             </w:pPr>
+            <w:r>
+              <w:rPr>
+                <w:rFonts w:ascii="Times New Roman" w:hAnsi="Times New Roman" w:cs="Times New Roman"/>
+                <w:b/>
+              </w:rPr>
+              <w:lastRenderedPageBreak/>
+              <w:t xml:space="preserve">High cost, no deep learning, </w:t>
+            </w:r>
+            <w:r>
+              <w:rPr>
+                <w:rFonts w:ascii="Times New Roman" w:hAnsi="Times New Roman" w:cs="Times New Roman"/>
+                <w:b/>
+              </w:rPr>
+              <w:lastRenderedPageBreak/>
+              <w:t>limited scalability discussion</w:t>
+            </w:r>
           </w:p>
         </w:tc>
       </w:tr>
@@ -1100,13 +1297,14 @@
                 <w:rFonts w:ascii="Times New Roman" w:hAnsi="Times New Roman" w:cs="Times New Roman"/>
                 <w:lang w:val="en-US"/>
               </w:rPr>
+              <w:lastRenderedPageBreak/>
               <w:t>4</w:t>
             </w:r>
           </w:p>
         </w:tc>
         <w:tc>
           <w:tcPr>
-            <w:tcW w:w="3133" w:type="dxa"/>
+            <w:tcW w:w="2826" w:type="dxa"/>
             <w:hideMark/>
           </w:tcPr>
           <w:p>
@@ -1115,8 +1313,41 @@
               <w:rPr>
                 <w:rFonts w:ascii="Times New Roman" w:hAnsi="Times New Roman" w:cs="Times New Roman"/>
                 <w:b/>
-              </w:rPr>
-            </w:pPr>
+                <w:lang w:val="en-US"/>
+              </w:rPr>
+            </w:pPr>
+            <w:r>
+              <w:rPr>
+                <w:rFonts w:ascii="Times New Roman" w:hAnsi="Times New Roman" w:cs="Times New Roman"/>
+                <w:b/>
+                <w:lang w:val="en-US"/>
+              </w:rPr>
+              <w:t>Empirical Investigation of Key Enablers for Secure DevOps Practices, 2025</w:t>
+            </w:r>
+          </w:p>
+        </w:tc>
+        <w:tc>
+          <w:tcPr>
+            <w:tcW w:w="2235" w:type="dxa"/>
+            <w:hideMark/>
+          </w:tcPr>
+          <w:p>
+            <w:pPr>
+              <w:spacing w:line="276" w:lineRule="auto"/>
+              <w:rPr>
+                <w:rFonts w:ascii="Times New Roman" w:hAnsi="Times New Roman" w:cs="Times New Roman"/>
+                <w:b/>
+                <w:lang w:val="en-US"/>
+              </w:rPr>
+            </w:pPr>
+            <w:r>
+              <w:rPr>
+                <w:rFonts w:ascii="Times New Roman" w:hAnsi="Times New Roman" w:cs="Times New Roman"/>
+                <w:b/>
+                <w:lang w:val="en-US"/>
+              </w:rPr>
+              <w:t>Empirical Study / Survey-based Research</w:t>
+            </w:r>
           </w:p>
         </w:tc>
         <w:tc>
@@ -1132,21 +1363,13 @@
                 <w:b/>
               </w:rPr>
             </w:pPr>
-          </w:p>
-        </w:tc>
-        <w:tc>
-          <w:tcPr>
-            <w:tcW w:w="1928" w:type="dxa"/>
-            <w:hideMark/>
-          </w:tcPr>
-          <w:p>
-            <w:pPr>
-              <w:spacing w:line="276" w:lineRule="auto"/>
-              <w:rPr>
-                <w:rFonts w:ascii="Times New Roman" w:hAnsi="Times New Roman" w:cs="Times New Roman"/>
-                <w:b/>
-              </w:rPr>
-            </w:pPr>
+            <w:r>
+              <w:rPr>
+                <w:rFonts w:ascii="Times New Roman" w:hAnsi="Times New Roman" w:cs="Times New Roman"/>
+                <w:b/>
+              </w:rPr>
+              <w:t>Strong statistical validation, industry-backed results, sustainability focus</w:t>
+            </w:r>
           </w:p>
         </w:tc>
         <w:tc>
@@ -1162,6 +1385,13 @@
                 <w:b/>
               </w:rPr>
             </w:pPr>
+            <w:r>
+              <w:rPr>
+                <w:rFonts w:ascii="Times New Roman" w:hAnsi="Times New Roman" w:cs="Times New Roman"/>
+                <w:b/>
+              </w:rPr>
+              <w:t>No technical implementation, survey bias risk, no performance benchmarking</w:t>
+            </w:r>
           </w:p>
         </w:tc>
       </w:tr>
@@ -1196,7 +1426,7 @@
         </w:tc>
         <w:tc>
           <w:tcPr>
-            <w:tcW w:w="3133" w:type="dxa"/>
+            <w:tcW w:w="2826" w:type="dxa"/>
             <w:hideMark/>
           </w:tcPr>
           <w:p>
@@ -1207,6 +1437,35 @@
                 <w:b/>
               </w:rPr>
             </w:pPr>
+            <w:r>
+              <w:rPr>
+                <w:rFonts w:ascii="Times New Roman" w:hAnsi="Times New Roman" w:cs="Times New Roman"/>
+                <w:b/>
+              </w:rPr>
+              <w:t>Prioritization Based Taxonomy of DevOps Security Challenges Using PROMETHEE – 2020</w:t>
+            </w:r>
+          </w:p>
+        </w:tc>
+        <w:tc>
+          <w:tcPr>
+            <w:tcW w:w="2235" w:type="dxa"/>
+            <w:hideMark/>
+          </w:tcPr>
+          <w:p>
+            <w:pPr>
+              <w:spacing w:line="276" w:lineRule="auto"/>
+              <w:rPr>
+                <w:rFonts w:ascii="Times New Roman" w:hAnsi="Times New Roman" w:cs="Times New Roman"/>
+                <w:b/>
+              </w:rPr>
+            </w:pPr>
+            <w:r>
+              <w:rPr>
+                <w:rFonts w:ascii="Times New Roman" w:hAnsi="Times New Roman" w:cs="Times New Roman"/>
+                <w:b/>
+              </w:rPr>
+              <w:t>Systematic Literature Review, expert survey, PROMETHEE-II prioritization</w:t>
+            </w:r>
           </w:p>
         </w:tc>
         <w:tc>
@@ -1222,21 +1481,13 @@
                 <w:b/>
               </w:rPr>
             </w:pPr>
-          </w:p>
-        </w:tc>
-        <w:tc>
-          <w:tcPr>
-            <w:tcW w:w="1928" w:type="dxa"/>
-            <w:hideMark/>
-          </w:tcPr>
-          <w:p>
-            <w:pPr>
-              <w:spacing w:line="276" w:lineRule="auto"/>
-              <w:rPr>
-                <w:rFonts w:ascii="Times New Roman" w:hAnsi="Times New Roman" w:cs="Times New Roman"/>
-                <w:b/>
-              </w:rPr>
-            </w:pPr>
+            <w:r>
+              <w:rPr>
+                <w:rFonts w:ascii="Times New Roman" w:hAnsi="Times New Roman" w:cs="Times New Roman"/>
+                <w:b/>
+              </w:rPr>
+              <w:t>Clear ranking of DevOps security challenges</w:t>
+            </w:r>
           </w:p>
         </w:tc>
         <w:tc>
@@ -1252,6 +1503,13 @@
                 <w:b/>
               </w:rPr>
             </w:pPr>
+            <w:r>
+              <w:rPr>
+                <w:rFonts w:ascii="Times New Roman" w:hAnsi="Times New Roman" w:cs="Times New Roman"/>
+                <w:b/>
+              </w:rPr>
+              <w:t>No practical implementation</w:t>
+            </w:r>
           </w:p>
         </w:tc>
       </w:tr>
@@ -1286,16 +1544,76 @@
         </w:tc>
         <w:tc>
           <w:tcPr>
-            <w:tcW w:w="3133" w:type="dxa"/>
-          </w:tcPr>
-          <w:p>
-            <w:pPr>
-              <w:spacing w:line="276" w:lineRule="auto"/>
-              <w:rPr>
-                <w:rFonts w:ascii="Times New Roman" w:hAnsi="Times New Roman" w:cs="Times New Roman"/>
-                <w:b/>
-              </w:rPr>
-            </w:pPr>
+            <w:tcW w:w="2826" w:type="dxa"/>
+          </w:tcPr>
+          <w:p>
+            <w:pPr>
+              <w:spacing w:line="276" w:lineRule="auto"/>
+              <w:rPr>
+                <w:rFonts w:ascii="Times New Roman" w:hAnsi="Times New Roman" w:cs="Times New Roman"/>
+                <w:b/>
+              </w:rPr>
+            </w:pPr>
+            <w:r>
+              <w:rPr>
+                <w:rFonts w:ascii="Times New Roman" w:hAnsi="Times New Roman" w:cs="Times New Roman"/>
+                <w:b/>
+              </w:rPr>
+              <w:t xml:space="preserve">Enhancing Smart Contract Security Through </w:t>
+            </w:r>
+            <w:proofErr w:type="spellStart"/>
+            <w:r>
+              <w:rPr>
+                <w:rFonts w:ascii="Times New Roman" w:hAnsi="Times New Roman" w:cs="Times New Roman"/>
+                <w:b/>
+              </w:rPr>
+              <w:t>DevSecOps</w:t>
+            </w:r>
+            <w:proofErr w:type="spellEnd"/>
+            <w:r>
+              <w:rPr>
+                <w:rFonts w:ascii="Times New Roman" w:hAnsi="Times New Roman" w:cs="Times New Roman"/>
+                <w:b/>
+              </w:rPr>
+              <w:t>: An Adaptive Approach for Vulnerability Detection – 2025</w:t>
+            </w:r>
+          </w:p>
+        </w:tc>
+        <w:tc>
+          <w:tcPr>
+            <w:tcW w:w="2235" w:type="dxa"/>
+          </w:tcPr>
+          <w:p>
+            <w:pPr>
+              <w:spacing w:line="276" w:lineRule="auto"/>
+              <w:rPr>
+                <w:rFonts w:ascii="Times New Roman" w:hAnsi="Times New Roman" w:cs="Times New Roman"/>
+                <w:b/>
+              </w:rPr>
+            </w:pPr>
+            <w:r>
+              <w:rPr>
+                <w:rFonts w:ascii="Times New Roman" w:hAnsi="Times New Roman" w:cs="Times New Roman"/>
+                <w:b/>
+              </w:rPr>
+              <w:t xml:space="preserve">Adaptive </w:t>
+            </w:r>
+            <w:proofErr w:type="spellStart"/>
+            <w:r>
+              <w:rPr>
+                <w:rFonts w:ascii="Times New Roman" w:hAnsi="Times New Roman" w:cs="Times New Roman"/>
+                <w:b/>
+              </w:rPr>
+              <w:t>DevSecOps</w:t>
+            </w:r>
+            <w:proofErr w:type="spellEnd"/>
+            <w:r>
+              <w:rPr>
+                <w:rFonts w:ascii="Times New Roman" w:hAnsi="Times New Roman" w:cs="Times New Roman"/>
+                <w:b/>
+              </w:rPr>
+              <w:t xml:space="preserve"> with AI and testing tools</w:t>
+            </w:r>
           </w:p>
         </w:tc>
         <w:tc>
@@ -1310,20 +1628,13 @@
                 <w:b/>
               </w:rPr>
             </w:pPr>
-          </w:p>
-        </w:tc>
-        <w:tc>
-          <w:tcPr>
-            <w:tcW w:w="1928" w:type="dxa"/>
-          </w:tcPr>
-          <w:p>
-            <w:pPr>
-              <w:spacing w:line="276" w:lineRule="auto"/>
-              <w:rPr>
-                <w:rFonts w:ascii="Times New Roman" w:hAnsi="Times New Roman" w:cs="Times New Roman"/>
-                <w:b/>
-              </w:rPr>
-            </w:pPr>
+            <w:r>
+              <w:rPr>
+                <w:rFonts w:ascii="Times New Roman" w:hAnsi="Times New Roman" w:cs="Times New Roman"/>
+                <w:b/>
+              </w:rPr>
+              <w:t>Early vulnerability detection</w:t>
+            </w:r>
           </w:p>
         </w:tc>
         <w:tc>
@@ -1338,6 +1649,13 @@
                 <w:b/>
               </w:rPr>
             </w:pPr>
+            <w:r>
+              <w:rPr>
+                <w:rFonts w:ascii="Times New Roman" w:hAnsi="Times New Roman" w:cs="Times New Roman"/>
+                <w:b/>
+              </w:rPr>
+              <w:t>Complex to implement</w:t>
+            </w:r>
           </w:p>
         </w:tc>
       </w:tr>
@@ -1372,16 +1690,44 @@
         </w:tc>
         <w:tc>
           <w:tcPr>
-            <w:tcW w:w="3133" w:type="dxa"/>
-          </w:tcPr>
-          <w:p>
-            <w:pPr>
-              <w:spacing w:line="276" w:lineRule="auto"/>
-              <w:rPr>
-                <w:rFonts w:ascii="Times New Roman" w:hAnsi="Times New Roman" w:cs="Times New Roman"/>
-                <w:b/>
-              </w:rPr>
-            </w:pPr>
+            <w:tcW w:w="2826" w:type="dxa"/>
+          </w:tcPr>
+          <w:p>
+            <w:pPr>
+              <w:spacing w:line="276" w:lineRule="auto"/>
+              <w:rPr>
+                <w:rFonts w:ascii="Times New Roman" w:hAnsi="Times New Roman" w:cs="Times New Roman"/>
+                <w:b/>
+              </w:rPr>
+            </w:pPr>
+            <w:r>
+              <w:rPr>
+                <w:rFonts w:ascii="Times New Roman" w:hAnsi="Times New Roman" w:cs="Times New Roman"/>
+                <w:b/>
+              </w:rPr>
+              <w:t>Effort Estimation in Agile and DevOps: A Systematic Literature Review of Stakeholder Dissatisfaction – 2025</w:t>
+            </w:r>
+          </w:p>
+        </w:tc>
+        <w:tc>
+          <w:tcPr>
+            <w:tcW w:w="2235" w:type="dxa"/>
+          </w:tcPr>
+          <w:p>
+            <w:pPr>
+              <w:spacing w:line="276" w:lineRule="auto"/>
+              <w:rPr>
+                <w:rFonts w:ascii="Times New Roman" w:hAnsi="Times New Roman" w:cs="Times New Roman"/>
+                <w:b/>
+              </w:rPr>
+            </w:pPr>
+            <w:r>
+              <w:rPr>
+                <w:rFonts w:ascii="Times New Roman" w:hAnsi="Times New Roman" w:cs="Times New Roman"/>
+                <w:b/>
+              </w:rPr>
+              <w:t>Systematic Literature Review using PICOS &amp; PRISMA</w:t>
+            </w:r>
           </w:p>
         </w:tc>
         <w:tc>
@@ -1396,20 +1742,13 @@
                 <w:b/>
               </w:rPr>
             </w:pPr>
-          </w:p>
-        </w:tc>
-        <w:tc>
-          <w:tcPr>
-            <w:tcW w:w="1928" w:type="dxa"/>
-          </w:tcPr>
-          <w:p>
-            <w:pPr>
-              <w:spacing w:line="276" w:lineRule="auto"/>
-              <w:rPr>
-                <w:rFonts w:ascii="Times New Roman" w:hAnsi="Times New Roman" w:cs="Times New Roman"/>
-                <w:b/>
-              </w:rPr>
-            </w:pPr>
+            <w:r>
+              <w:rPr>
+                <w:rFonts w:ascii="Times New Roman" w:hAnsi="Times New Roman" w:cs="Times New Roman"/>
+                <w:b/>
+              </w:rPr>
+              <w:t>Identifies causes of estimation failure</w:t>
+            </w:r>
           </w:p>
         </w:tc>
         <w:tc>
@@ -1424,6 +1763,13 @@
                 <w:b/>
               </w:rPr>
             </w:pPr>
+            <w:r>
+              <w:rPr>
+                <w:rFonts w:ascii="Times New Roman" w:hAnsi="Times New Roman" w:cs="Times New Roman"/>
+                <w:b/>
+              </w:rPr>
+              <w:t>No new estimation model</w:t>
+            </w:r>
           </w:p>
         </w:tc>
       </w:tr>
@@ -1458,16 +1804,69 @@
         </w:tc>
         <w:tc>
           <w:tcPr>
-            <w:tcW w:w="3133" w:type="dxa"/>
-          </w:tcPr>
-          <w:p>
-            <w:pPr>
-              <w:spacing w:line="276" w:lineRule="auto"/>
-              <w:rPr>
-                <w:rFonts w:ascii="Times New Roman" w:hAnsi="Times New Roman" w:cs="Times New Roman"/>
-                <w:b/>
-              </w:rPr>
-            </w:pPr>
+            <w:tcW w:w="2826" w:type="dxa"/>
+          </w:tcPr>
+          <w:p>
+            <w:pPr>
+              <w:spacing w:line="276" w:lineRule="auto"/>
+              <w:rPr>
+                <w:rFonts w:ascii="Times New Roman" w:hAnsi="Times New Roman" w:cs="Times New Roman"/>
+                <w:b/>
+              </w:rPr>
+            </w:pPr>
+            <w:r>
+              <w:rPr>
+                <w:rFonts w:ascii="Times New Roman" w:hAnsi="Times New Roman" w:cs="Times New Roman"/>
+                <w:b/>
+              </w:rPr>
+              <w:t xml:space="preserve">Extensive Review of Threat Models for </w:t>
+            </w:r>
+            <w:proofErr w:type="spellStart"/>
+            <w:r>
+              <w:rPr>
+                <w:rFonts w:ascii="Times New Roman" w:hAnsi="Times New Roman" w:cs="Times New Roman"/>
+                <w:b/>
+              </w:rPr>
+              <w:t>DevSecOps</w:t>
+            </w:r>
+            <w:proofErr w:type="spellEnd"/>
+            <w:r>
+              <w:rPr>
+                <w:rFonts w:ascii="Times New Roman" w:hAnsi="Times New Roman" w:cs="Times New Roman"/>
+                <w:b/>
+              </w:rPr>
+              <w:t xml:space="preserve"> (2025)</w:t>
+            </w:r>
+          </w:p>
+        </w:tc>
+        <w:tc>
+          <w:tcPr>
+            <w:tcW w:w="2235" w:type="dxa"/>
+          </w:tcPr>
+          <w:p>
+            <w:pPr>
+              <w:spacing w:line="276" w:lineRule="auto"/>
+              <w:rPr>
+                <w:rFonts w:ascii="Times New Roman" w:hAnsi="Times New Roman" w:cs="Times New Roman"/>
+                <w:b/>
+              </w:rPr>
+            </w:pPr>
+            <w:r>
+              <w:rPr>
+                <w:rFonts w:ascii="Times New Roman" w:hAnsi="Times New Roman" w:cs="Times New Roman"/>
+                <w:b/>
+              </w:rPr>
+              <w:t xml:space="preserve">Systematic review of threat models and proposal of layered framework for single- and multi-cloud </w:t>
+            </w:r>
+            <w:proofErr w:type="spellStart"/>
+            <w:r>
+              <w:rPr>
+                <w:rFonts w:ascii="Times New Roman" w:hAnsi="Times New Roman" w:cs="Times New Roman"/>
+                <w:b/>
+              </w:rPr>
+              <w:t>DevSecOps</w:t>
+            </w:r>
+            <w:proofErr w:type="spellEnd"/>
           </w:p>
         </w:tc>
         <w:tc>
@@ -1482,20 +1881,13 @@
                 <w:b/>
               </w:rPr>
             </w:pPr>
-          </w:p>
-        </w:tc>
-        <w:tc>
-          <w:tcPr>
-            <w:tcW w:w="1928" w:type="dxa"/>
-          </w:tcPr>
-          <w:p>
-            <w:pPr>
-              <w:spacing w:line="276" w:lineRule="auto"/>
-              <w:rPr>
-                <w:rFonts w:ascii="Times New Roman" w:hAnsi="Times New Roman" w:cs="Times New Roman"/>
-                <w:b/>
-              </w:rPr>
-            </w:pPr>
+            <w:r>
+              <w:rPr>
+                <w:rFonts w:ascii="Times New Roman" w:hAnsi="Times New Roman" w:cs="Times New Roman"/>
+                <w:b/>
+              </w:rPr>
+              <w:t>Comprehensive coverage of threat models; supports early security integration</w:t>
+            </w:r>
           </w:p>
         </w:tc>
         <w:tc>
@@ -1510,6 +1902,13 @@
                 <w:b/>
               </w:rPr>
             </w:pPr>
+            <w:r>
+              <w:rPr>
+                <w:rFonts w:ascii="Times New Roman" w:hAnsi="Times New Roman" w:cs="Times New Roman"/>
+                <w:b/>
+              </w:rPr>
+              <w:t>Conceptual study with no experimental validation</w:t>
+            </w:r>
           </w:p>
         </w:tc>
       </w:tr>
@@ -1544,16 +1943,44 @@
         </w:tc>
         <w:tc>
           <w:tcPr>
-            <w:tcW w:w="3133" w:type="dxa"/>
-          </w:tcPr>
-          <w:p>
-            <w:pPr>
-              <w:spacing w:line="276" w:lineRule="auto"/>
-              <w:rPr>
-                <w:rFonts w:ascii="Times New Roman" w:hAnsi="Times New Roman" w:cs="Times New Roman"/>
-                <w:b/>
-              </w:rPr>
-            </w:pPr>
+            <w:tcW w:w="2826" w:type="dxa"/>
+          </w:tcPr>
+          <w:p>
+            <w:pPr>
+              <w:spacing w:line="276" w:lineRule="auto"/>
+              <w:rPr>
+                <w:rFonts w:ascii="Times New Roman" w:hAnsi="Times New Roman" w:cs="Times New Roman"/>
+                <w:b/>
+              </w:rPr>
+            </w:pPr>
+            <w:r>
+              <w:rPr>
+                <w:rFonts w:ascii="Times New Roman" w:hAnsi="Times New Roman" w:cs="Times New Roman"/>
+                <w:b/>
+              </w:rPr>
+              <w:t>Automated Security Findings Management: A Case Study in Industrial DevOps (2024).</w:t>
+            </w:r>
+          </w:p>
+        </w:tc>
+        <w:tc>
+          <w:tcPr>
+            <w:tcW w:w="2235" w:type="dxa"/>
+          </w:tcPr>
+          <w:p>
+            <w:pPr>
+              <w:spacing w:line="276" w:lineRule="auto"/>
+              <w:rPr>
+                <w:rFonts w:ascii="Times New Roman" w:hAnsi="Times New Roman" w:cs="Times New Roman"/>
+                <w:b/>
+              </w:rPr>
+            </w:pPr>
+            <w:r>
+              <w:rPr>
+                <w:rFonts w:ascii="Times New Roman" w:hAnsi="Times New Roman" w:cs="Times New Roman"/>
+                <w:b/>
+              </w:rPr>
+              <w:t>An automated semantic knowledge base that parses, deduplicates, and enriches security findings from diverse DevOps tools.</w:t>
+            </w:r>
           </w:p>
         </w:tc>
         <w:tc>
@@ -1568,20 +1995,13 @@
                 <w:b/>
               </w:rPr>
             </w:pPr>
-          </w:p>
-        </w:tc>
-        <w:tc>
-          <w:tcPr>
-            <w:tcW w:w="1928" w:type="dxa"/>
-          </w:tcPr>
-          <w:p>
-            <w:pPr>
-              <w:spacing w:line="276" w:lineRule="auto"/>
-              <w:rPr>
-                <w:rFonts w:ascii="Times New Roman" w:hAnsi="Times New Roman" w:cs="Times New Roman"/>
-                <w:b/>
-              </w:rPr>
-            </w:pPr>
+            <w:r>
+              <w:rPr>
+                <w:rFonts w:ascii="Times New Roman" w:hAnsi="Times New Roman" w:cs="Times New Roman"/>
+                <w:b/>
+              </w:rPr>
+              <w:t>Enhanced data visibility and quality.</w:t>
+            </w:r>
           </w:p>
         </w:tc>
         <w:tc>
@@ -1596,6 +2016,13 @@
                 <w:b/>
               </w:rPr>
             </w:pPr>
+            <w:r>
+              <w:rPr>
+                <w:rFonts w:ascii="Times New Roman" w:hAnsi="Times New Roman" w:cs="Times New Roman"/>
+                <w:b/>
+              </w:rPr>
+              <w:t>Manual rule definition required.</w:t>
+            </w:r>
           </w:p>
         </w:tc>
       </w:tr>
@@ -1630,16 +2057,60 @@
         </w:tc>
         <w:tc>
           <w:tcPr>
-            <w:tcW w:w="3133" w:type="dxa"/>
-          </w:tcPr>
-          <w:p>
-            <w:pPr>
-              <w:spacing w:line="276" w:lineRule="auto"/>
-              <w:rPr>
-                <w:rFonts w:ascii="Times New Roman" w:hAnsi="Times New Roman" w:cs="Times New Roman"/>
-                <w:b/>
-              </w:rPr>
-            </w:pPr>
+            <w:tcW w:w="2826" w:type="dxa"/>
+          </w:tcPr>
+          <w:p>
+            <w:pPr>
+              <w:spacing w:line="276" w:lineRule="auto"/>
+              <w:rPr>
+                <w:rFonts w:ascii="Times New Roman" w:hAnsi="Times New Roman" w:cs="Times New Roman"/>
+                <w:b/>
+              </w:rPr>
+            </w:pPr>
+            <w:r>
+              <w:rPr>
+                <w:rFonts w:ascii="Times New Roman" w:hAnsi="Times New Roman" w:cs="Times New Roman"/>
+                <w:b/>
+              </w:rPr>
+              <w:t>Challenges affecting the successful adoption of DevOps practices: A systematic literature review (2024).</w:t>
+            </w:r>
+          </w:p>
+        </w:tc>
+        <w:tc>
+          <w:tcPr>
+            <w:tcW w:w="2235" w:type="dxa"/>
+          </w:tcPr>
+          <w:p>
+            <w:pPr>
+              <w:spacing w:line="276" w:lineRule="auto"/>
+              <w:rPr>
+                <w:rFonts w:ascii="Times New Roman" w:hAnsi="Times New Roman" w:cs="Times New Roman"/>
+                <w:b/>
+              </w:rPr>
+            </w:pPr>
+            <w:r>
+              <w:rPr>
+                <w:rFonts w:ascii="Times New Roman" w:hAnsi="Times New Roman" w:cs="Times New Roman"/>
+                <w:b/>
+              </w:rPr>
+              <w:t xml:space="preserve">A systematic literature review (SLR) utilizing the PRISMA approach to </w:t>
+            </w:r>
+            <w:proofErr w:type="spellStart"/>
+            <w:r>
+              <w:rPr>
+                <w:rFonts w:ascii="Times New Roman" w:hAnsi="Times New Roman" w:cs="Times New Roman"/>
+                <w:b/>
+              </w:rPr>
+              <w:t>analyze</w:t>
+            </w:r>
+            <w:proofErr w:type="spellEnd"/>
+            <w:r>
+              <w:rPr>
+                <w:rFonts w:ascii="Times New Roman" w:hAnsi="Times New Roman" w:cs="Times New Roman"/>
+                <w:b/>
+              </w:rPr>
+              <w:t xml:space="preserve"> 21 selected research articles.</w:t>
+            </w:r>
           </w:p>
         </w:tc>
         <w:tc>
@@ -1654,20 +2125,13 @@
                 <w:b/>
               </w:rPr>
             </w:pPr>
-          </w:p>
-        </w:tc>
-        <w:tc>
-          <w:tcPr>
-            <w:tcW w:w="1928" w:type="dxa"/>
-          </w:tcPr>
-          <w:p>
-            <w:pPr>
-              <w:spacing w:line="276" w:lineRule="auto"/>
-              <w:rPr>
-                <w:rFonts w:ascii="Times New Roman" w:hAnsi="Times New Roman" w:cs="Times New Roman"/>
-                <w:b/>
-              </w:rPr>
-            </w:pPr>
+            <w:r>
+              <w:rPr>
+                <w:rFonts w:ascii="Times New Roman" w:hAnsi="Times New Roman" w:cs="Times New Roman"/>
+                <w:b/>
+              </w:rPr>
+              <w:t>Identifies success factors and provides structured frameworks for understanding obstacles.</w:t>
+            </w:r>
           </w:p>
         </w:tc>
         <w:tc>
@@ -1682,10 +2146,44 @@
                 <w:b/>
               </w:rPr>
             </w:pPr>
+            <w:r>
+              <w:rPr>
+                <w:rFonts w:ascii="Times New Roman" w:hAnsi="Times New Roman" w:cs="Times New Roman"/>
+                <w:b/>
+              </w:rPr>
+              <w:t>Highlights cultural resistance, high costs, skill gaps, and legacy complexities.</w:t>
+            </w:r>
           </w:p>
         </w:tc>
       </w:tr>
     </w:tbl>
+    <w:p>
+      <w:pPr>
+        <w:spacing w:after="0" w:line="360" w:lineRule="auto"/>
+        <w:rPr>
+          <w:rFonts w:ascii="Times New Roman" w:hAnsi="Times New Roman" w:cs="Times New Roman"/>
+          <w:b/>
+        </w:rPr>
+      </w:pPr>
+    </w:p>
+    <w:p>
+      <w:pPr>
+        <w:spacing w:after="0" w:line="360" w:lineRule="auto"/>
+        <w:rPr>
+          <w:rFonts w:ascii="Times New Roman" w:hAnsi="Times New Roman" w:cs="Times New Roman"/>
+          <w:b/>
+        </w:rPr>
+      </w:pPr>
+    </w:p>
+    <w:p>
+      <w:pPr>
+        <w:spacing w:after="0" w:line="360" w:lineRule="auto"/>
+        <w:rPr>
+          <w:rFonts w:ascii="Times New Roman" w:hAnsi="Times New Roman" w:cs="Times New Roman"/>
+          <w:b/>
+        </w:rPr>
+      </w:pPr>
+    </w:p>
     <w:p>
       <w:pPr>
         <w:spacing w:after="0" w:line="360" w:lineRule="auto"/>
@@ -1729,7 +2227,6 @@
                 <w:b/>
                 <w:bCs/>
               </w:rPr>
-              <w:lastRenderedPageBreak/>
               <w:t>Panel Members Remarks (if any):</w:t>
             </w:r>
           </w:p>
@@ -4251,6 +4748,7 @@
   <w:style w:type="character" w:default="1" w:styleId="DefaultParagraphFont">
     <w:name w:val="Default Paragraph Font"/>
     <w:uiPriority w:val="1"/>
+    <w:semiHidden/>
     <w:unhideWhenUsed/>
   </w:style>
   <w:style w:type="table" w:default="1" w:styleId="TableNormal">

</xml_diff>

<commit_message>
Updated the ppt and Synopsis by adding the Guide name
</commit_message>
<xml_diff>
--- a/Synopsis/CSEP23605 Review 0 - Synopsis Submission.docx
+++ b/Synopsis/CSEP23605 Review 0 - Synopsis Submission.docx
@@ -484,21 +484,7 @@
               <w:rPr>
                 <w:rFonts w:ascii="Times New Roman" w:hAnsi="Times New Roman" w:cs="Times New Roman"/>
               </w:rPr>
-              <w:t>In modern software development, security vulnerabilities are often detected only after application deployment. This delayed detection increases the risk of cyberattacks, leads to high remediation costs, and causes delays in software releases. Traditional DevOps pipelines focus mainly on speed and automation, often neglecting security integration during early development stages. Hence, there is a strong need for a Secure DevOps (</w:t>
-            </w:r>
-            <w:proofErr w:type="spellStart"/>
-            <w:r>
-              <w:rPr>
-                <w:rFonts w:ascii="Times New Roman" w:hAnsi="Times New Roman" w:cs="Times New Roman"/>
-              </w:rPr>
-              <w:t>DevSecOps</w:t>
-            </w:r>
-            <w:proofErr w:type="spellEnd"/>
-            <w:r>
-              <w:rPr>
-                <w:rFonts w:ascii="Times New Roman" w:hAnsi="Times New Roman" w:cs="Times New Roman"/>
-              </w:rPr>
-              <w:t>) approach that integrates security testing and controls directly into the CI/CD pipeline to ensure early detection and mitigation of vulnerabilities.</w:t>
+              <w:t>In modern software development, security vulnerabilities are often detected only after application deployment. This delayed detection increases the risk of cyberattacks, leads to high remediation costs, and causes delays in software releases. Traditional DevOps pipelines focus mainly on speed and automation, often neglecting security integration during early development stages. Hence, there is a strong need for a Secure DevOps (DevSecOps) approach that integrates security testing and controls directly into the CI/CD pipeline to ensure early detection and mitigation of vulnerabilities.</w:t>
             </w:r>
           </w:p>
         </w:tc>
@@ -852,43 +838,7 @@
                 <w:bCs/>
                 <w:lang w:val="en-US"/>
               </w:rPr>
-              <w:t xml:space="preserve">Implementing and Automating Security Scanning to a </w:t>
-            </w:r>
-            <w:proofErr w:type="spellStart"/>
-            <w:r>
-              <w:rPr>
-                <w:rFonts w:ascii="Times New Roman" w:hAnsi="Times New Roman" w:cs="Times New Roman"/>
-                <w:bCs/>
-                <w:lang w:val="en-US"/>
-              </w:rPr>
-              <w:t>DevSecOps</w:t>
-            </w:r>
-            <w:proofErr w:type="spellEnd"/>
-            <w:r>
-              <w:rPr>
-                <w:rFonts w:ascii="Times New Roman" w:hAnsi="Times New Roman" w:cs="Times New Roman"/>
-                <w:bCs/>
-                <w:lang w:val="en-US"/>
-              </w:rPr>
-              <w:t xml:space="preserve"> CI/CD </w:t>
-            </w:r>
-            <w:proofErr w:type="gramStart"/>
-            <w:r>
-              <w:rPr>
-                <w:rFonts w:ascii="Times New Roman" w:hAnsi="Times New Roman" w:cs="Times New Roman"/>
-                <w:bCs/>
-                <w:lang w:val="en-US"/>
-              </w:rPr>
-              <w:t>Pipeline ,</w:t>
-            </w:r>
-            <w:proofErr w:type="gramEnd"/>
-            <w:r>
-              <w:rPr>
-                <w:rFonts w:ascii="Times New Roman" w:hAnsi="Times New Roman" w:cs="Times New Roman"/>
-                <w:bCs/>
-                <w:lang w:val="en-US"/>
-              </w:rPr>
-              <w:t xml:space="preserve"> 2023</w:t>
+              <w:t>Implementing and Automating Security Scanning to a DevSecOps CI/CD Pipeline , 2023</w:t>
             </w:r>
           </w:p>
           <w:p>
@@ -935,25 +885,7 @@
                 <w:bCs/>
                 <w:lang w:val="en-US"/>
               </w:rPr>
-              <w:t xml:space="preserve">Automated </w:t>
-            </w:r>
-            <w:proofErr w:type="spellStart"/>
-            <w:r>
-              <w:rPr>
-                <w:rFonts w:ascii="Times New Roman" w:hAnsi="Times New Roman" w:cs="Times New Roman"/>
-                <w:bCs/>
-                <w:lang w:val="en-US"/>
-              </w:rPr>
-              <w:t>DevSecOps</w:t>
-            </w:r>
-            <w:proofErr w:type="spellEnd"/>
-            <w:r>
-              <w:rPr>
-                <w:rFonts w:ascii="Times New Roman" w:hAnsi="Times New Roman" w:cs="Times New Roman"/>
-                <w:bCs/>
-                <w:lang w:val="en-US"/>
-              </w:rPr>
-              <w:t xml:space="preserve"> CI/CD with integrated SAST and DAST scanning</w:t>
+              <w:t>Automated DevSecOps CI/CD with integrated SAST and DAST scanning</w:t>
             </w:r>
           </w:p>
           <w:p>
@@ -1424,47 +1356,7 @@
                 <w:bCs/>
                 <w:lang w:val="en-US"/>
               </w:rPr>
-              <w:t xml:space="preserve">Enhancing Smart Contract Security Through </w:t>
-            </w:r>
-            <w:proofErr w:type="spellStart"/>
-            <w:r>
-              <w:rPr>
-                <w:rFonts w:ascii="Times New Roman" w:hAnsi="Times New Roman" w:cs="Times New Roman"/>
-                <w:b/>
-                <w:bCs/>
-                <w:lang w:val="en-US"/>
-              </w:rPr>
-              <w:t>DevSecOps</w:t>
-            </w:r>
-            <w:proofErr w:type="spellEnd"/>
-            <w:r>
-              <w:rPr>
-                <w:rFonts w:ascii="Times New Roman" w:hAnsi="Times New Roman" w:cs="Times New Roman"/>
-                <w:b/>
-                <w:bCs/>
-                <w:lang w:val="en-US"/>
-              </w:rPr>
-              <w:t xml:space="preserve">: An Adaptive Approach for Vulnerability </w:t>
-            </w:r>
-            <w:proofErr w:type="gramStart"/>
-            <w:r>
-              <w:rPr>
-                <w:rFonts w:ascii="Times New Roman" w:hAnsi="Times New Roman" w:cs="Times New Roman"/>
-                <w:b/>
-                <w:bCs/>
-                <w:lang w:val="en-US"/>
-              </w:rPr>
-              <w:t>Detection ,</w:t>
-            </w:r>
-            <w:proofErr w:type="gramEnd"/>
-            <w:r>
-              <w:rPr>
-                <w:rFonts w:ascii="Times New Roman" w:hAnsi="Times New Roman" w:cs="Times New Roman"/>
-                <w:b/>
-                <w:bCs/>
-                <w:lang w:val="en-US"/>
-              </w:rPr>
-              <w:t xml:space="preserve"> 2025</w:t>
+              <w:t>Enhancing Smart Contract Security Through DevSecOps: An Adaptive Approach for Vulnerability Detection , 2025</w:t>
             </w:r>
           </w:p>
           <w:p>
@@ -1514,27 +1406,7 @@
                 <w:bCs/>
                 <w:lang w:val="en-US"/>
               </w:rPr>
-              <w:t xml:space="preserve">Adaptive </w:t>
-            </w:r>
-            <w:proofErr w:type="spellStart"/>
-            <w:r>
-              <w:rPr>
-                <w:rFonts w:ascii="Times New Roman" w:hAnsi="Times New Roman" w:cs="Times New Roman"/>
-                <w:b/>
-                <w:bCs/>
-                <w:lang w:val="en-US"/>
-              </w:rPr>
-              <w:t>DevSecOps</w:t>
-            </w:r>
-            <w:proofErr w:type="spellEnd"/>
-            <w:r>
-              <w:rPr>
-                <w:rFonts w:ascii="Times New Roman" w:hAnsi="Times New Roman" w:cs="Times New Roman"/>
-                <w:b/>
-                <w:bCs/>
-                <w:lang w:val="en-US"/>
-              </w:rPr>
-              <w:t xml:space="preserve"> with AI and testing tools</w:t>
+              <w:t>Adaptive DevSecOps with AI and testing tools</w:t>
             </w:r>
           </w:p>
           <w:p>
@@ -2014,23 +1886,7 @@
                 <w:rFonts w:ascii="Times New Roman" w:hAnsi="Times New Roman" w:cs="Times New Roman"/>
                 <w:lang w:val="en-US"/>
               </w:rPr>
-              <w:t xml:space="preserve">Extensive Review of Threat Models for </w:t>
-            </w:r>
-            <w:proofErr w:type="spellStart"/>
-            <w:r>
-              <w:rPr>
-                <w:rFonts w:ascii="Times New Roman" w:hAnsi="Times New Roman" w:cs="Times New Roman"/>
-                <w:lang w:val="en-US"/>
-              </w:rPr>
-              <w:t>DevSecOps</w:t>
-            </w:r>
-            <w:proofErr w:type="spellEnd"/>
-            <w:r>
-              <w:rPr>
-                <w:rFonts w:ascii="Times New Roman" w:hAnsi="Times New Roman" w:cs="Times New Roman"/>
-                <w:lang w:val="en-US"/>
-              </w:rPr>
-              <w:t xml:space="preserve"> ,2025</w:t>
+              <w:t>Extensive Review of Threat Models for DevSecOps ,2025</w:t>
             </w:r>
           </w:p>
         </w:tc>
@@ -2052,33 +1908,8 @@
                 <w:rFonts w:ascii="Times New Roman" w:hAnsi="Times New Roman" w:cs="Times New Roman"/>
                 <w:lang w:val="en-US"/>
               </w:rPr>
-              <w:t xml:space="preserve">Systematic review of threat models with layered </w:t>
-            </w:r>
-            <w:proofErr w:type="spellStart"/>
-            <w:r>
-              <w:rPr>
-                <w:rFonts w:ascii="Times New Roman" w:hAnsi="Times New Roman" w:cs="Times New Roman"/>
-                <w:lang w:val="en-US"/>
-              </w:rPr>
-              <w:t>DevSecOps</w:t>
-            </w:r>
-            <w:proofErr w:type="spellEnd"/>
-            <w:r>
-              <w:rPr>
-                <w:rFonts w:ascii="Times New Roman" w:hAnsi="Times New Roman" w:cs="Times New Roman"/>
-                <w:lang w:val="en-US"/>
-              </w:rPr>
-              <w:t xml:space="preserve"> framework for single and </w:t>
-            </w:r>
-            <w:proofErr w:type="spellStart"/>
-            <w:r>
-              <w:rPr>
-                <w:rFonts w:ascii="Times New Roman" w:hAnsi="Times New Roman" w:cs="Times New Roman"/>
-                <w:lang w:val="en-US"/>
-              </w:rPr>
-              <w:t>multicloud</w:t>
-            </w:r>
-            <w:proofErr w:type="spellEnd"/>
+              <w:t>Systematic review of threat models with layered DevSecOps framework for single and multicloud</w:t>
+            </w:r>
           </w:p>
         </w:tc>
         <w:tc>
@@ -2538,23 +2369,7 @@
                 <w:rFonts w:ascii="Times New Roman" w:hAnsi="Times New Roman" w:cs="Times New Roman"/>
                 <w:lang w:val="en-US"/>
               </w:rPr>
-              <w:t xml:space="preserve">High accuracy, strong robustness, </w:t>
-            </w:r>
-            <w:proofErr w:type="spellStart"/>
-            <w:r>
-              <w:rPr>
-                <w:rFonts w:ascii="Times New Roman" w:hAnsi="Times New Roman" w:cs="Times New Roman"/>
-                <w:lang w:val="en-US"/>
-              </w:rPr>
-              <w:t>DevSecOps</w:t>
-            </w:r>
-            <w:proofErr w:type="spellEnd"/>
-            <w:r>
-              <w:rPr>
-                <w:rFonts w:ascii="Times New Roman" w:hAnsi="Times New Roman" w:cs="Times New Roman"/>
-                <w:lang w:val="en-US"/>
-              </w:rPr>
-              <w:t xml:space="preserve"> automation, lower bias.</w:t>
+              <w:t>High accuracy, strong robustness, DevSecOps automation, lower bias.</w:t>
             </w:r>
           </w:p>
           <w:p>
@@ -3269,6 +3084,14 @@
                 <w:b/>
               </w:rPr>
             </w:pPr>
+            <w:r>
+              <w:rPr>
+                <w:rFonts w:ascii="Times New Roman" w:hAnsi="Times New Roman" w:cs="Times New Roman"/>
+                <w:b/>
+                <w:bCs/>
+              </w:rPr>
+              <w:t>Prof. Sameena H S</w:t>
+            </w:r>
           </w:p>
         </w:tc>
         <w:tc>
@@ -3334,6 +3157,27 @@
                 <w:b/>
               </w:rPr>
             </w:pPr>
+            <w:r>
+              <w:rPr>
+                <w:rFonts w:ascii="Times New Roman" w:hAnsi="Times New Roman" w:cs="Times New Roman"/>
+                <w:b/>
+              </w:rPr>
+              <w:t>Dr</w:t>
+            </w:r>
+            <w:r>
+              <w:rPr>
+                <w:rFonts w:ascii="Times New Roman" w:hAnsi="Times New Roman" w:cs="Times New Roman"/>
+                <w:b/>
+              </w:rPr>
+              <w:t>.</w:t>
+            </w:r>
+            <w:r>
+              <w:rPr>
+                <w:rFonts w:ascii="Times New Roman" w:hAnsi="Times New Roman" w:cs="Times New Roman"/>
+                <w:b/>
+              </w:rPr>
+              <w:t xml:space="preserve"> Shruthi G</w:t>
+            </w:r>
           </w:p>
         </w:tc>
         <w:tc>
@@ -5173,6 +5017,7 @@
   <w:style w:type="character" w:default="1" w:styleId="DefaultParagraphFont">
     <w:name w:val="Default Paragraph Font"/>
     <w:uiPriority w:val="1"/>
+    <w:semiHidden/>
     <w:unhideWhenUsed/>
   </w:style>
   <w:style w:type="table" w:default="1" w:styleId="TableNormal">

</xml_diff>